<commit_message>
Apply multi-perspective review fixes (P0/P1) and add full review report
- Fix three overclaims (demo results, AI confidentiality, purchase urging)
- Add small-company subsidy row, insurance-eligibility and cap notes, time-stamped info
- Add NotebookLM credit, voice-input / rate-limit / restroom / QR-prep guidance
- Unify note timecodes with script; rename checklist; expand ops checklist
- review-report.md: 4-reviewer parallel review + cross-review + panel discussion

Co-Authored-By: Claude Fable 5 <noreply@anthropic.com>
Claude-Session: https://claude.ai/code/session_01A8JHh9fRFxK2FeDQDxaECV
</commit_message>
<xml_diff>
--- a/docs/seminar/demo-guide.docx
+++ b/docs/seminar/demo-guide.docx
@@ -532,7 +532,7 @@
                 <w:sz w:val="20"/>
                 <w:szCs w:val="20"/>
               </w:rPr>
-              <w:t xml:space="preserve">「皆さんの会社に、こういう紙、毎日届いてませんか？」と手書きFAXを掲げる（実物を見せるのが掴み）</w:t>
+              <w:t xml:space="preserve">手書きFAXを掲げ「これはデモ用に作った架空の注文書です。でも、こういう紙、毎日届いてませんか？」と先に種明かし（種明かしを先にする手品師は疑われない）</w:t>
             </w:r>
           </w:p>
         </w:tc>
@@ -712,7 +712,7 @@
                 <w:sz w:val="20"/>
                 <w:szCs w:val="20"/>
               </w:rPr>
-              <w:t xml:space="preserve">表が出たら一呼吸おいて：「毎朝これを転記している人の時間、今のでゼロになりました」</w:t>
+              <w:t xml:space="preserve">表が出たら一呼吸おいて：「毎朝これを転記している人の時間、ゼロにできます。おたくで何分浮くかは、おたくで測ってください」</w:t>
             </w:r>
           </w:p>
         </w:tc>
@@ -1834,7 +1834,117 @@
           <w:sz w:val="21"/>
           <w:szCs w:val="21"/>
         </w:rPr>
-        <w:t xml:space="preserve">□ モバイルルーター（会場Wi-Fiを信用しない）</w:t>
+        <w:t xml:space="preserve">□ モバイルルーター（会場Wi-Fiを信用しない）＋貸出用の充電器を2〜3本</w:t>
+      </w:r>
+    </w:p>
+    <w:p>
+      <w:pPr>
+        <w:pStyle w:val="ListParagraph"/>
+        <w:numPr>
+          <w:ilvl w:val="0"/>
+          <w:numId w:val="2"/>
+        </w:numPr>
+        <w:spacing w:after="80"/>
+      </w:pPr>
+      <w:r>
+        <w:rPr>
+          <w:rFonts w:ascii="Yu Gothic" w:cs="Yu Gothic" w:eastAsia="Yu Gothic" w:hAnsi="Yu Gothic"/>
+          <w:b w:val="false"/>
+          <w:bCs w:val="false"/>
+          <w:i w:val="false"/>
+          <w:iCs w:val="false"/>
+          <w:sz w:val="21"/>
+          <w:szCs w:val="21"/>
+        </w:rPr>
+        <w:t xml:space="preserve">□ 事務局に渡す資料は「ノート削除版」のスライドか確認した（講師ノートには営業上の手の内が書いてある。流出＝信頼消滅）</w:t>
+      </w:r>
+    </w:p>
+    <w:p>
+      <w:pPr>
+        <w:pStyle w:val="ListParagraph"/>
+        <w:numPr>
+          <w:ilvl w:val="0"/>
+          <w:numId w:val="2"/>
+        </w:numPr>
+        <w:spacing w:after="80"/>
+      </w:pPr>
+      <w:r>
+        <w:rPr>
+          <w:rFonts w:ascii="Yu Gothic" w:cs="Yu Gothic" w:eastAsia="Yu Gothic" w:hAnsi="Yu Gothic"/>
+          <w:b w:val="false"/>
+          <w:bCs w:val="false"/>
+          <w:i w:val="false"/>
+          <w:iCs w:val="false"/>
+          <w:sz w:val="21"/>
+          <w:szCs w:val="21"/>
+        </w:rPr>
+        <w:t xml:space="preserve">□ デモ直前に「これはデモ用の架空の注文書／規則です」と必ず口頭で種明かしする（種明かしを先にする手品師は疑われない）</w:t>
+      </w:r>
+    </w:p>
+    <w:p>
+      <w:pPr>
+        <w:pStyle w:val="ListParagraph"/>
+        <w:numPr>
+          <w:ilvl w:val="0"/>
+          <w:numId w:val="2"/>
+        </w:numPr>
+        <w:spacing w:after="80"/>
+      </w:pPr>
+      <w:r>
+        <w:rPr>
+          <w:rFonts w:ascii="Yu Gothic" w:cs="Yu Gothic" w:eastAsia="Yu Gothic" w:hAnsi="Yu Gothic"/>
+          <w:b w:val="false"/>
+          <w:bCs w:val="false"/>
+          <w:i w:val="false"/>
+          <w:iCs w:val="false"/>
+          <w:sz w:val="21"/>
+          <w:szCs w:val="21"/>
+        </w:rPr>
+        <w:t xml:space="preserve">□ セミナー後の営業連絡は、アンケートで相談を希望した方に限定する（用紙に書いた利用目的の約束を守る）</w:t>
+      </w:r>
+    </w:p>
+    <w:p>
+      <w:pPr>
+        <w:pStyle w:val="ListParagraph"/>
+        <w:numPr>
+          <w:ilvl w:val="0"/>
+          <w:numId w:val="2"/>
+        </w:numPr>
+        <w:spacing w:after="80"/>
+      </w:pPr>
+      <w:r>
+        <w:rPr>
+          <w:rFonts w:ascii="Yu Gothic" w:cs="Yu Gothic" w:eastAsia="Yu Gothic" w:hAnsi="Yu Gothic"/>
+          <w:b w:val="false"/>
+          <w:bCs w:val="false"/>
+          <w:i w:val="false"/>
+          <w:iCs w:val="false"/>
+          <w:sz w:val="21"/>
+          <w:szCs w:val="21"/>
+        </w:rPr>
+        <w:t xml:space="preserve">□ 会場を収録して動画に使う場合は、受付掲示とアンケートで映り込み・発言使用の同意を取る</w:t>
+      </w:r>
+    </w:p>
+    <w:p>
+      <w:pPr>
+        <w:pStyle w:val="ListParagraph"/>
+        <w:numPr>
+          <w:ilvl w:val="0"/>
+          <w:numId w:val="2"/>
+        </w:numPr>
+        <w:spacing w:after="80"/>
+      </w:pPr>
+      <w:r>
+        <w:rPr>
+          <w:rFonts w:ascii="Yu Gothic" w:cs="Yu Gothic" w:eastAsia="Yu Gothic" w:hAnsi="Yu Gothic"/>
+          <w:b w:val="false"/>
+          <w:bCs w:val="false"/>
+          <w:i w:val="false"/>
+          <w:iCs w:val="false"/>
+          <w:sz w:val="21"/>
+          <w:szCs w:val="21"/>
+        </w:rPr>
+        <w:t xml:space="preserve">□ 前日までに会場の実機プロジェクターでスライドを投影し、最後列から本文が読めるか確認した</w:t>
       </w:r>
     </w:p>
     <w:p>

</xml_diff>